<commit_message>
docs: v1.1 README + report + blue Super AI poster
</commit_message>
<xml_diff>
--- a/SuperAI_SS6_Technical_Report.docx
+++ b/SuperAI_SS6_Technical_Report.docx
@@ -11,7 +11,7 @@
         <w:rPr>
           <w:b/>
           <w:bCs/>
-          <w:color w:val="146336"/>
+          <w:color w:val="1B4F9C"/>
           <w:sz w:val="56"/>
           <w:szCs w:val="56"/>
         </w:rPr>
@@ -73,7 +73,7 @@
           <w:sz w:val="22"/>
           <w:szCs w:val="22"/>
         </w:rPr>
-        <w:t xml:space="preserve">Version 1.0  ·  June 2026</w:t>
+        <w:t>Version 1.1  ·  June 2026</w:t>
       </w:r>
     </w:p>
     <w:p>
@@ -126,7 +126,7 @@
         <w:spacing w:after="120" w:line="276"/>
       </w:pPr>
       <w:r>
-        <w:t xml:space="preserve">This report presents SuperAI SS6, an autonomous software-engineering pipeline that ingests a natural-language requirement and carries it through five phases - Understand, Plan, Debate, Execute, and Review - before halting for human approval. The pipeline combines local retrieval-augmented generation (RAG) for codebase grounding, a provider-agnostic large language model (LLM) layer, a deterministic weighted evaluator for selecting among competing implementation plans, and a context-aware compliance gate that enforces a project's architectural rules. To evaluate the system under realistic conditions, we constructed eleven-7, a production-shaped mock of a convenience-store delivery platform modelled on Thailand's 7-Eleven delivery service, comprising an Angular front end, a Node.js/Express API, a MySQL data model, and AWS SNS/SQS/SMS messaging emulated with LocalStack. We report results across four evaluation harnesses, a unit-test suite, and - critically - a live end-to-end deployment using Docker on real infrastructure, during which the system surfaced and we corrected six integration defects that static, offline testing could not detect. We additionally repackage the pipeline as a pip-installable library exposing both a command-line tool (ss6) and a callable Python API. We conclude with an impact analysis, representative real-world use scenarios, a production-readiness gap assessment, and a roadmap toward operational deployment.</w:t>
+        <w:t>This report presents SuperAI SS6, an autonomous software-engineering pipeline that ingests a natural-language requirement and carries it through five phases - Understand, Plan, Debate, Execute, and Review - before halting for human approval. The pipeline combines local retrieval-augmented generation (RAG) for codebase grounding, a provider-agnostic large language model (LLM) layer, a deterministic weighted evaluator for selecting among competing implementation plans, and a context-aware compliance gate that enforces a project's architectural rules. In this revision the Execute and Review phases are closed into a self-correcting loop: the gate runs the target repository's real TypeScript compiler and unit tests inside the isolated branch, and when a check fails the Developer is re-invoked with the violations fed back until it converges or a retry budget is exhausted. The Developer now edits existing files through surgical anchored edits and unified diffs rather than overwriting them, and the offline retriever is upgraded from a weak hashing fallback to a BM25 ranker with an out-of-vocabulary confidence signal. To evaluate the system under realistic conditions, we constructed eleven-7, a production-shaped mock of a convenience-store delivery platform modelled on Thailand's 7-Eleven delivery service, comprising an Angular front end, a Node.js/Express API, a MySQL data model, and AWS SNS/SQS/SMS messaging emulated with LocalStack. We report results across four evaluation harnesses and a 35-test suite; a live end-to-end Docker deployment that surfaced and corrected six integration defects; a measured comparison of lexical, BM25, and semantic retrieval; and a live autonomous-generation run on a local Ollama model whose output compiled and passed tests yet was correctly blocked by the compliance gate. We repackage the pipeline as a pip-installable library exposing a command-line tool (ss6) and a callable Python API, and conclude with an impact analysis, real-world use scenarios, a production-readiness assessment, and a roadmap toward operational deployment.</w:t>
       </w:r>
     </w:p>
     <w:p>
@@ -1276,7 +1276,7 @@
         <w:spacing w:after="120" w:line="276"/>
       </w:pPr>
       <w:r>
-        <w:t xml:space="preserve">All four phase harnesses and the unit-test suite pass against the eleven-7 corpus (76 indexed files, 155 chunks).</w:t>
+        <w:t>All four phase harnesses and the unit-test suite (35 tests) pass against the eleven-7 corpus (76 indexed files, 155 chunks). The Execute phase is gated by the target repository's real tsc and jest run inside the isolated branch copy, and a generate-gate-repair loop re-invokes the Developer with fed-back violations - up to a configurable budget - until the gate passes.</w:t>
       </w:r>
     </w:p>
     <w:tbl>
@@ -2000,11 +2000,9 @@
           <w:b/>
           <w:bCs/>
         </w:rPr>
-        <w:t xml:space="preserve">Compliance-gate discrimination. </w:t>
-      </w:r>
-      <w:r>
-        <w:t xml:space="preserve">A gate that always passes is worthless. The Review suite admits a compliant Angular component and rejects five non-compliant fixtures: an inline hex colour, a direct fetch() call, HttpClient inside a component, a screen reusing no canonical primitive, and a file with no export.</w:t>
-      </w:r>
+        <w:t>Compliance-gate discrimination. A gate that always passes is worthless. The Review suite admits a compliant Angular component and rejects five non-compliant fixtures: an inline hex colour, a direct fetch() call, HttpClient inside a component, a screen reusing no canonical primitive, and a file with no export. The gate additionally flags hardcoded secrets and dynamic code execution, and - corrected after the live run reported below - exempts non-code assets (.html/.scss) from the export requirement.</w:t>
+      </w:r>
+      <w:r/>
     </w:p>
     <w:p>
       <w:pPr>
@@ -2019,7 +2017,7 @@
         <w:spacing w:after="120" w:line="276"/>
       </w:pPr>
       <w:r>
-        <w:t xml:space="preserve">With the semantic encoder (all-MiniLM-L6-v2) and a persistent vector store, the hardened retrieval set lands every positive in the top three (Recall@3 = 100%, MRR ~ 0.96) on the reference corpus. On a host without the encoder, the deterministic lexical fallback is used; non-paraphrased queries still retrieve the correct file at rank 1, while deliberately paraphrased queries miss - the expected behaviour that makes the metric meaningful. The semantic baseline for the eleven-7 corpus should be re-measured on a host with the encoder present; the lexical fallback verifies plumbing, not model quality.</w:t>
+        <w:t>Retrieval was measured three ways on an 18-query labelled set (paraphrased positives plus four hard negatives whose subject matter is absent from the repository: GraphQL, biometric login, Kubernetes autoscaling, and a Redis cache). The legacy hashing fallback is weak (Recall@1/3/5 = 33/44/50%, MRR 0.39, false-positive rate 50%). Replacing it with a BM25 ranker - identifier-aware tokenisation, IDF weighting, and an out-of-vocabulary coverage signal - more than doubles quality with no model download (78/83/89%, MRR 0.81, FP 25%). The semantic encoder (all-MiniLM-L6-v2 with a persistent vector store) leads at deeper cut-offs (72/89/94%, MRR 0.80) but, notably, BM25 beats it at Recall@1 and on false positives: the small encoder confidently matches absent concepts by analogy, whereas BM25's coverage signal withholds confidence when a query's distinctive terms are out of vocabulary. The strongest configuration is therefore a hybrid - BM25 for precision and out-of-vocabulary rejection, the encoder for recall at depth.</w:t>
       </w:r>
     </w:p>
     <w:p>
@@ -3498,6 +3496,20 @@
     </w:tbl>
     <w:p>
       <w:pPr>
+        <w:pStyle w:val="Heading2"/>
+      </w:pPr>
+      <w:r>
+        <w:t>5.5 Autonomous generation on a live model</w:t>
+      </w:r>
+    </w:p>
+    <w:p>
+      <w:pPr/>
+      <w:r>
+        <w:t>To test the pipeline beyond the deterministic mock, we ran it end to end on a local Ollama model (qwen2.5-coder:7b). Two observations stand out. First, the live model produced genuinely different plans, and the deterministic Debate selected the performance-oriented Plan A rather than the mock's reuse-oriented Plan B - evidence that the scoring responds to real content, not a template. Second, on Execute and Review the model's code compiled and passed the unit tests (tsc and jest both green) yet violated the System Blueprint: it did not reuse the canonical primitives and modified a shared one. The repair loop ran the full three attempts, feeding the violations back each time; the model failed to converge, so the gate remained failed and the pipeline halted without passing the change to review. This is the human-in-the-loop safety property operating against a real, imperfect model - a stronger demonstration than a clean pass. The run also surfaced a defect in the gate itself (the export requirement firing on .html and .scss assets), which we corrected and covered with a regression test.</w:t>
+      </w:r>
+    </w:p>
+    <w:p>
+      <w:pPr>
         <w:pStyle w:val="Heading1"/>
       </w:pPr>
       <w:r>
@@ -4496,11 +4508,9 @@
           <w:b/>
           <w:bCs/>
         </w:rPr>
-        <w:t xml:space="preserve">Roadmap. </w:t>
-      </w:r>
-      <w:r>
-        <w:t xml:space="preserve">(1) Re-run the semantic retrieval baseline and a live-provider plan-quality spot-check. (2) Add CI that runs the four harnesses and the unit tests on every change. (3) Harden the target app for operations: readiness/liveness probes, a migration runner, metrics and tracing, real authentication. (4) Extend the compliance gate with project-specific rules and a severity model. (5) Publish the package to an internal index for one-command installation.</w:t>
-      </w:r>
+        <w:t>Roadmap. Several items from the original plan are now implemented and tested: the gate runs the repository's real tsc and jest; a generate-gate-repair loop drives the Developer to convergence; the Developer edits existing files via anchored edits and unified diffs (git apply --3way); the offline retriever is a BM25 ranker and the semantic baseline has been measured; the Debate winner is validated against post-execution evidence; and a clarification step and per-phase tracing were added. The unit-test suite grew from 17 to 35. Remaining work: a hybrid BM25-plus-semantic retriever; automatic three-way conflict resolution; generalisation to a second, real repository; continuous integration on every change; and operational hardening of the target app (readiness/liveness probes, a migration runner, metrics and tracing, real authentication).</w:t>
+      </w:r>
+      <w:r/>
     </w:p>
     <w:p>
       <w:pPr>
@@ -4581,7 +4591,7 @@
         <w:spacing w:after="60" w:line="276"/>
       </w:pPr>
       <w:r>
-        <w:t xml:space="preserve">The plan and code content shown offline are produced by a deterministic mock; while the gates and scoring are provider-independent, the substantive quality of plans and code from a live model has not yet been graded by human reviewers.</w:t>
+        <w:t>The plan and code content shown offline are produced by a deterministic mock. A first live-model run (Ollama qwen2.5-coder:7b) has now been performed end to end; its output compiled and passed tests but failed the compliance gate, so a broader, human-graded study of live-model plan and code quality across many requirements remains future work.</w:t>
       </w:r>
     </w:p>
     <w:p>
@@ -4594,7 +4604,7 @@
         <w:spacing w:after="60" w:line="276"/>
       </w:pPr>
       <w:r>
-        <w:t xml:space="preserve">The semantic retrieval baseline for the eleven-7 corpus was not re-measured on a host with the sentence encoder installed; the reported lexical numbers verify plumbing, not model quality.</w:t>
+        <w:t>The semantic retrieval baseline for the eleven-7 corpus has now been measured (Recall@5 = 94% with all-MiniLM-L6-v2, MRR 0.80); a larger labelled set and a hybrid retriever would tighten and improve it further.</w:t>
       </w:r>
     </w:p>
     <w:p>
@@ -4620,7 +4630,7 @@
         <w:spacing w:after="60" w:line="276"/>
       </w:pPr>
       <w:r>
-        <w:t xml:space="preserve">The compliance gate uses lightweight syntactic checks; it is sound for the encoded rules but not a substitute for full static analysis or tests run inside the target repository.</w:t>
+        <w:t>The compliance gate now runs the target repository's real TypeScript compiler and unit tests in addition to the rule checks; the remaining rule checks are still lightweight and syntactic rather than full static analysis.</w:t>
       </w:r>
     </w:p>
     <w:p>
@@ -4649,7 +4659,7 @@
         <w:spacing w:after="120" w:line="276"/>
       </w:pPr>
       <w:r>
-        <w:t xml:space="preserve">SuperAI SS6 demonstrates that an autonomous software-engineering pipeline can be grounded, rule-abiding, safe, reproducible, and - after packaging - genuinely easy to adopt. By pairing the pipeline with eleven-7, a production-shaped mock, and validating the whole system on real Docker and MySQL infrastructure, we obtained evidence that static testing alone would have missed: six concrete integration defects, each found and fixed at runtime. The deterministic evaluator and the human-in-the-loop compliance gate keep the consequential decisions transparent and the merge boundary firmly under human control. The remaining gaps - a live-provider quality study, a re-measured semantic baseline, and operational hardening - are well understood and form a clear roadmap toward production use.</w:t>
+        <w:t>SuperAI SS6 demonstrates that an autonomous software-engineering pipeline can be grounded, rule-abiding, safe, reproducible, and - after packaging - genuinely easy to adopt. By pairing the pipeline with eleven-7, a production-shaped mock, and validating the whole system on real Docker and MySQL infrastructure, we obtained evidence that static testing alone would have missed. A real gate (tsc and jest) and a generate-gate-repair loop now make the Execute and Review phases self-correcting, and a live run on a local model showed the gate blocking non-compliant code even when it compiled and passed tests. The deterministic evaluator and the human-in-the-loop compliance gate keep the consequential decisions transparent and the merge boundary firmly under human control. The remaining gaps - a broader human-graded live-model study, a hybrid retriever, automatic conflict resolution, and generalisation beyond a single target application - are well understood and form a clear roadmap toward production use.</w:t>
       </w:r>
     </w:p>
     <w:p>
@@ -5057,7 +5067,7 @@
     <w:next w:val="Normal"/>
     <w:qFormat/>
     <w:rPr>
-      <w:color w:val="2E74B5"/>
+      <w:color w:val="1B4F9C"/>
       <w:sz w:val="32"/>
       <w:szCs w:val="32"/>
     </w:rPr>
@@ -5068,7 +5078,7 @@
     <w:next w:val="Normal"/>
     <w:qFormat/>
     <w:rPr>
-      <w:color w:val="2E74B5"/>
+      <w:color w:val="1B4F9C"/>
       <w:sz w:val="26"/>
       <w:szCs w:val="26"/>
     </w:rPr>
@@ -5079,7 +5089,7 @@
     <w:next w:val="Normal"/>
     <w:qFormat/>
     <w:rPr>
-      <w:color w:val="1F4D78"/>
+      <w:color w:val="133A73"/>
       <w:sz w:val="24"/>
       <w:szCs w:val="24"/>
     </w:rPr>
@@ -5092,7 +5102,7 @@
     <w:rPr>
       <w:i/>
       <w:iCs/>
-      <w:color w:val="2E74B5"/>
+      <w:color w:val="1B4F9C"/>
     </w:rPr>
   </w:style>
   <w:style w:type="paragraph" w:styleId="Heading5">
@@ -5101,7 +5111,7 @@
     <w:next w:val="Normal"/>
     <w:qFormat/>
     <w:rPr>
-      <w:color w:val="2E74B5"/>
+      <w:color w:val="1B4F9C"/>
     </w:rPr>
   </w:style>
   <w:style w:type="paragraph" w:styleId="Heading6">
@@ -5110,7 +5120,7 @@
     <w:next w:val="Normal"/>
     <w:qFormat/>
     <w:rPr>
-      <w:color w:val="1F4D78"/>
+      <w:color w:val="133A73"/>
     </w:rPr>
   </w:style>
   <w:style w:type="paragraph" w:styleId="Strong">
@@ -5225,7 +5235,7 @@
       <w:rFonts w:ascii="Arial" w:cs="Arial" w:eastAsia="Arial" w:hAnsi="Arial"/>
       <w:b/>
       <w:bCs/>
-      <w:color w:val="146336"/>
+      <w:color w:val="1B4F9C"/>
       <w:sz w:val="30"/>
       <w:szCs w:val="30"/>
     </w:rPr>

</xml_diff>